<commit_message>
Add Stage Gates workflow (Governance & Stage-Gates: Not Yet -> Partial)
New Stage Gates tab per program: four phase gates with exit criteria
(auto-checked from program data or human-attested), required approver
and rationale, approve / approve-with-exception / hold, phase advance on
approval, a decision log, and an advisory Gate Readiness Agent memo.
Phase edits made outside the workflow are logged as bypasses. Roadmap
and PfMO Function Map updated to 46% weighted, still labeled WIP.

Co-Authored-By: Claude Sonnet 5.5 <noreply@anthropic.com>
Claude-Session: https://claude.ai/code/session_014YccidrEp6ATN1ZCYA8Q2h
</commit_message>
<xml_diff>
--- a/agentic-pmo-suite/PfMO-Function-Map.docx
+++ b/agentic-pmo-suite/PfMO-Function-Map.docx
@@ -52,7 +52,7 @@
           <w:sz w:val="14"/>
           <w:szCs w:val="14"/>
         </w:rPr>
-        <w:t xml:space="preserve">Of 14 standard PfMO functions: 4 fully built, 4 partially covered, 6 not yet attempted — roughly 43% weighted completion against the full PfMO role. Full capability detail is in the Agentic PMO Suite one-pager and the app's own Roadmap &amp; Scope tab.</w:t>
+        <w:t xml:space="preserve">Of 14 standard PfMO functions: 4 fully built, 5 partially covered, 5 not yet attempted — roughly 46% weighted completion against the full PfMO role. Full capability detail is in the Agentic PMO Suite one-pager and the app's own Roadmap &amp; Scope tab.</w:t>
       </w:r>
     </w:p>
     <w:p>
@@ -1400,11 +1400,11 @@
               <w:rPr>
                 <w:b/>
                 <w:bCs/>
-                <w:color w:val="6B7280"/>
-                <w:sz w:val="14"/>
-                <w:szCs w:val="14"/>
-              </w:rPr>
-              <w:t xml:space="preserve">Not Yet</w:t>
+                <w:color w:val="9A6A1A"/>
+                <w:sz w:val="14"/>
+                <w:szCs w:val="14"/>
+              </w:rPr>
+              <w:t xml:space="preserve">Partial</w:t>
             </w:r>
           </w:p>
         </w:tc>
@@ -1432,7 +1432,7 @@
                 <w:sz w:val="14"/>
                 <w:szCs w:val="14"/>
               </w:rPr>
-              <w:t xml:space="preserve">Phase is tracked as a field; there's no formal gate-approval workflow.</w:t>
+              <w:t xml:space="preserve">Four phase gates with exit criteria (some checked from program data, some human-attested), required approver and rationale, exceptions and holds, a decision log, and an advisory agent readiness memo. No role-based permissions, notifications, or configurable gate templates yet.</w:t>
             </w:r>
           </w:p>
         </w:tc>

</xml_diff>

<commit_message>
Add TPM capacity heat map to the Portfolio Tracker
Month-by-month TPM load from program start/end dates, colored against
each TPM's cap, with over-cap, overdue-program and undated-program
callouts. TPM capacity only; engineering and budget capacity remain
unmodeled. Roadmap and PfMO Function Map text updated.

Co-Authored-By: Claude Sonnet 5.5 <noreply@anthropic.com>
Claude-Session: https://claude.ai/code/session_014YccidrEp6ATN1ZCYA8Q2h
</commit_message>
<xml_diff>
--- a/agentic-pmo-suite/PfMO-Function-Map.docx
+++ b/agentic-pmo-suite/PfMO-Function-Map.docx
@@ -760,7 +760,7 @@
                 <w:sz w:val="14"/>
                 <w:szCs w:val="14"/>
               </w:rPr>
-              <w:t xml:space="preserve">TPM allocation is capped at 80% of capacity and enforced automatically. Broader engineering/budget capacity isn't modeled.</w:t>
+              <w:t xml:space="preserve">TPM allocation is capped at 80% of capacity and enforced automatically, with a month-by-month TPM heat map built from program dates. Engineering and budget capacity aren't modeled.</w:t>
             </w:r>
           </w:p>
         </w:tc>
@@ -1096,7 +1096,7 @@
                 <w:sz w:val="14"/>
                 <w:szCs w:val="14"/>
               </w:rPr>
-              <w:t xml:space="preserve">Tracker shows per-program RAG/budget/TPM load, plus an OKR alignment rollup (% tied, % tied and metrics-consistent, budget by OKR, flagged mismatches). No capacity heat map or financial rollup yet.</w:t>
+              <w:t xml:space="preserve">Tracker shows per-program RAG/budget/TPM load, plus an OKR alignment rollup (% tied, % tied and metrics-consistent, budget by OKR, flagged mismatches). No financial rollup or exportable reports yet.</w:t>
             </w:r>
           </w:p>
         </w:tc>

</xml_diff>

<commit_message>
Add Financials: budget vs actuals, burn, forecast and CPI/SPI
Per-program Financials tab (manual monthly actuals, self-reported %
complete) with rule-computed burn, runway, forecast at completion and
earned-value indices, a RAG-vs-financials disagreement flag, a portfolio
rollup on the Tracker, and a financial snapshot fed into the Status
Report agent. Seed actuals are labeled illustrative. Financial
Management moves Not Yet -> Partial (50% weighted).

Co-Authored-By: Claude Sonnet 5.5 <noreply@anthropic.com>
Claude-Session: https://claude.ai/code/session_014YccidrEp6ATN1ZCYA8Q2h
</commit_message>
<xml_diff>
--- a/agentic-pmo-suite/PfMO-Function-Map.docx
+++ b/agentic-pmo-suite/PfMO-Function-Map.docx
@@ -52,7 +52,7 @@
           <w:sz w:val="14"/>
           <w:szCs w:val="14"/>
         </w:rPr>
-        <w:t xml:space="preserve">Of 14 standard PfMO functions: 4 fully built, 5 partially covered, 5 not yet attempted — roughly 46% weighted completion against the full PfMO role. Full capability detail is in the Agentic PMO Suite one-pager and the app's own Roadmap &amp; Scope tab.</w:t>
+        <w:t xml:space="preserve">Of 14 standard PfMO functions: 4 fully built, 6 partially covered, 4 not yet attempted — roughly 50% weighted completion against the full PfMO role. Full capability detail is in the Agentic PMO Suite one-pager and the app's own Roadmap &amp; Scope tab.</w:t>
       </w:r>
     </w:p>
     <w:p>
@@ -1096,7 +1096,7 @@
                 <w:sz w:val="14"/>
                 <w:szCs w:val="14"/>
               </w:rPr>
-              <w:t xml:space="preserve">Tracker shows per-program RAG/budget/TPM load, plus an OKR alignment rollup (% tied, % tied and metrics-consistent, budget by OKR, flagged mismatches). No financial rollup or exportable reports yet.</w:t>
+              <w:t xml:space="preserve">Tracker shows per-program RAG/budget/TPM load, plus an OKR alignment rollup (% tied, % tied and metrics-consistent, budget by OKR, flagged mismatches). Financials roll up here too. No exportable reports yet.</w:t>
             </w:r>
           </w:p>
         </w:tc>
@@ -1176,11 +1176,11 @@
               <w:rPr>
                 <w:b/>
                 <w:bCs/>
-                <w:color w:val="6B7280"/>
-                <w:sz w:val="14"/>
-                <w:szCs w:val="14"/>
-              </w:rPr>
-              <w:t xml:space="preserve">Not Yet</w:t>
+                <w:color w:val="9A6A1A"/>
+                <w:sz w:val="14"/>
+                <w:szCs w:val="14"/>
+              </w:rPr>
+              <w:t xml:space="preserve">Partial</w:t>
             </w:r>
           </w:p>
         </w:tc>
@@ -1208,7 +1208,7 @@
                 <w:sz w:val="14"/>
                 <w:szCs w:val="14"/>
               </w:rPr>
-              <w:t xml:space="preserve">Budget is a static field today — no actuals, forecasting, or EVM (CPI/SPI).</w:t>
+              <w:t xml:space="preserve">Budget vs. actuals, burn rate and runway, forecast at completion, and CPI/SPI per program and rolled up, plus a RAG-vs-financials disagreement flag. Built on manually entered monthly actuals and self-reported % complete (seed data is illustrative). No finance-system feed, cost categories, or phased forecasts.</w:t>
             </w:r>
           </w:p>
         </w:tc>

</xml_diff>

<commit_message>
Add audit trail: who/when/what/why log with Audit Log page
Append-only log (no edit/delete in the UI) of score overrides (reason
required), program edits, intake decisions, TPM allocations, financial
entries, gate decisions and agent runs. Self-declared "Acting as" name;
filterable Audit Log page with CSV download. Audit & Compliance moves
Not Yet -> Partial (54% weighted); one-pagers updated.

Co-Authored-By: Claude Sonnet 5.5 <noreply@anthropic.com>
Claude-Session: https://claude.ai/code/session_014YccidrEp6ATN1ZCYA8Q2h
</commit_message>
<xml_diff>
--- a/agentic-pmo-suite/PfMO-Function-Map.docx
+++ b/agentic-pmo-suite/PfMO-Function-Map.docx
@@ -52,7 +52,7 @@
           <w:sz w:val="14"/>
           <w:szCs w:val="14"/>
         </w:rPr>
-        <w:t xml:space="preserve">Of 14 standard PfMO functions: 4 fully built, 6 partially covered, 4 not yet attempted — roughly 50% weighted completion against the full PfMO role. Full capability detail is in the Agentic PMO Suite one-pager and the app's own Roadmap &amp; Scope tab.</w:t>
+        <w:t xml:space="preserve">Of 14 standard PfMO functions: 4 fully built, 7 partially covered, 3 not yet attempted — roughly 54% weighted completion against the full PfMO role. Full capability detail is in the Agentic PMO Suite one-pager and the app's own Roadmap &amp; Scope tab.</w:t>
       </w:r>
     </w:p>
     <w:p>
@@ -1624,11 +1624,11 @@
               <w:rPr>
                 <w:b/>
                 <w:bCs/>
-                <w:color w:val="6B7280"/>
-                <w:sz w:val="14"/>
-                <w:szCs w:val="14"/>
-              </w:rPr>
-              <w:t xml:space="preserve">Not Yet</w:t>
+                <w:color w:val="9A6A1A"/>
+                <w:sz w:val="14"/>
+                <w:szCs w:val="14"/>
+              </w:rPr>
+              <w:t xml:space="preserve">Partial</w:t>
             </w:r>
           </w:p>
         </w:tc>
@@ -1656,7 +1656,7 @@
                 <w:sz w:val="14"/>
                 <w:szCs w:val="14"/>
               </w:rPr>
-              <w:t xml:space="preserve">Overrides are badged and reversible; a timestamped who/when/why log doesn't exist yet.</w:t>
+              <w:t xml:space="preserve">Audit log of who, when, what changed (before and after) and why, covering score overrides, program edits, intake decisions, allocations, financial entries, gate decisions and agent runs; filterable, with CSV download. Who is self-declared (no login) and the log is not tamper-proof.</w:t>
             </w:r>
           </w:p>
         </w:tc>

</xml_diff>